<commit_message>
feat: implement Delivery Challan system with PDF generation, site management, and UI dialog
</commit_message>
<xml_diff>
--- a/DC 26.docx
+++ b/DC 26.docx
@@ -49,22 +49,7 @@
               </w:rPr>
             </w:pPr>
             <w:r>
-              <w:rPr>
-                <w:rFonts w:cs="Arial"/>
-                <w:b/>
-                <w:sz w:val="36"/>
-                <w:szCs w:val="36"/>
-              </w:rPr>
-              <w:t>NON</w:t>
-            </w:r>
-            <w:r>
-              <w:rPr>
-                <w:rFonts w:cs="Arial"/>
-                <w:b/>
-                <w:sz w:val="36"/>
-                <w:szCs w:val="36"/>
-              </w:rPr>
-              <w:t xml:space="preserve"> RETURNABLE DELIVERY CHALLAN </w:t>
+              <w:t>{{ dc_title }}</w:t>
             </w:r>
           </w:p>
         </w:tc>
@@ -237,41 +222,15 @@
               </w:rPr>
             </w:pPr>
             <w:r>
-              <w:rPr>
-                <w:rFonts w:cs="Arial"/>
-                <w:sz w:val="28"/>
-                <w:szCs w:val="28"/>
-              </w:rPr>
-              <w:t xml:space="preserve">D.C No.       </w:t>
-            </w:r>
-            <w:r>
-              <w:rPr>
-                <w:rFonts w:cs="Arial"/>
-                <w:sz w:val="28"/>
-                <w:szCs w:val="28"/>
-              </w:rPr>
-              <w:t xml:space="preserve">   </w:t>
-            </w:r>
-            <w:r>
-              <w:rPr>
-                <w:rFonts w:cs="Arial"/>
-                <w:sz w:val="28"/>
-                <w:szCs w:val="28"/>
-              </w:rPr>
-              <w:t xml:space="preserve">:  </w:t>
-            </w:r>
-          </w:p>
-          <w:p>
-            <w:pPr>
-              <w:spacing w:after="0" w:line="240" w:lineRule="auto"/>
-            </w:pPr>
-            <w:r>
-              <w:rPr>
-                <w:rFonts w:cs="Arial"/>
-                <w:sz w:val="28"/>
-                <w:szCs w:val="28"/>
-              </w:rPr>
-              <w:t xml:space="preserve">DATE              :   </w:t>
+              <w:t>D.C No.          : {{ dc_no }}</w:t>
+            </w:r>
+          </w:p>
+          <w:p>
+            <w:pPr>
+              <w:spacing w:after="0" w:line="240" w:lineRule="auto"/>
+            </w:pPr>
+            <w:r>
+              <w:t>DATE              : {{ date }}</w:t>
             </w:r>
           </w:p>
         </w:tc>
@@ -386,19 +345,18 @@
               </w:rPr>
             </w:pPr>
             <w:r>
+              <w:t>DELIVER TO:</w:t>
+            </w:r>
+          </w:p>
+          <w:p>
+            <w:pPr>
               <w:rPr>
                 <w:rFonts w:cs="Arial"/>
-                <w:u w:val="single"/>
-              </w:rPr>
-              <w:t>DELIVER TO:</w:t>
-            </w:r>
-          </w:p>
-          <w:p>
-            <w:pPr>
-              <w:rPr>
-                <w:rFonts w:cs="Arial"/>
-              </w:rPr>
-            </w:pPr>
+              </w:rPr>
+            </w:pPr>
+            <w:r>
+              <w:t>{{ deliver_to }}</w:t>
+            </w:r>
           </w:p>
         </w:tc>
       </w:tr>
@@ -511,82 +469,97 @@
               <w:spacing w:after="0" w:line="240" w:lineRule="auto"/>
               <w:jc w:val="center"/>
             </w:pPr>
-          </w:p>
-          <w:p>
-            <w:pPr>
-              <w:spacing w:after="0" w:line="240" w:lineRule="auto"/>
-            </w:pPr>
-          </w:p>
-          <w:p>
-            <w:pPr>
-              <w:spacing w:after="0" w:line="240" w:lineRule="auto"/>
-            </w:pPr>
-          </w:p>
-          <w:p>
-            <w:pPr>
-              <w:spacing w:after="0" w:line="240" w:lineRule="auto"/>
-            </w:pPr>
-          </w:p>
-          <w:p>
-            <w:pPr>
-              <w:spacing w:after="0" w:line="240" w:lineRule="auto"/>
-            </w:pPr>
-          </w:p>
-          <w:p>
-            <w:pPr>
-              <w:spacing w:after="0" w:line="240" w:lineRule="auto"/>
-              <w:jc w:val="center"/>
-            </w:pPr>
-          </w:p>
-          <w:p>
-            <w:pPr>
-              <w:spacing w:after="0" w:line="240" w:lineRule="auto"/>
-              <w:jc w:val="center"/>
-            </w:pPr>
-          </w:p>
-          <w:p>
-            <w:pPr>
-              <w:spacing w:after="0" w:line="240" w:lineRule="auto"/>
-              <w:jc w:val="center"/>
-            </w:pPr>
-          </w:p>
-          <w:p>
-            <w:pPr>
-              <w:spacing w:after="0" w:line="240" w:lineRule="auto"/>
-              <w:jc w:val="center"/>
-            </w:pPr>
-          </w:p>
-          <w:p>
-            <w:pPr>
-              <w:spacing w:after="0" w:line="240" w:lineRule="auto"/>
-              <w:jc w:val="center"/>
-            </w:pPr>
-          </w:p>
-          <w:p>
-            <w:pPr>
-              <w:spacing w:after="0" w:line="240" w:lineRule="auto"/>
-              <w:jc w:val="center"/>
-            </w:pPr>
-          </w:p>
-          <w:p>
-            <w:pPr>
-              <w:spacing w:after="0" w:line="240" w:lineRule="auto"/>
-              <w:jc w:val="center"/>
-            </w:pPr>
-          </w:p>
-          <w:p>
-            <w:pPr>
-              <w:spacing w:after="0" w:line="240" w:lineRule="auto"/>
-              <w:jc w:val="center"/>
-            </w:pPr>
-          </w:p>
-          <w:p>
-            <w:pPr>
-              <w:spacing w:after="0" w:line="240" w:lineRule="auto"/>
-            </w:pPr>
-            <w:r>
-              <w:t>(NOT FOR SALE , OWN USE ONLY)</w:t>
-            </w:r>
+            <w:r>
+              <w:t>{% for item in items %}</w:t>
+              <w:br/>
+              <w:t>{{ item.description }}</w:t>
+            </w:r>
+          </w:p>
+          <w:p>
+            <w:pPr>
+              <w:spacing w:after="0" w:line="240" w:lineRule="auto"/>
+            </w:pPr>
+            <w:r/>
+          </w:p>
+          <w:p>
+            <w:pPr>
+              <w:spacing w:after="0" w:line="240" w:lineRule="auto"/>
+            </w:pPr>
+            <w:r/>
+          </w:p>
+          <w:p>
+            <w:pPr>
+              <w:spacing w:after="0" w:line="240" w:lineRule="auto"/>
+            </w:pPr>
+            <w:r/>
+          </w:p>
+          <w:p>
+            <w:pPr>
+              <w:spacing w:after="0" w:line="240" w:lineRule="auto"/>
+            </w:pPr>
+            <w:r/>
+          </w:p>
+          <w:p>
+            <w:pPr>
+              <w:spacing w:after="0" w:line="240" w:lineRule="auto"/>
+              <w:jc w:val="center"/>
+            </w:pPr>
+            <w:r/>
+          </w:p>
+          <w:p>
+            <w:pPr>
+              <w:spacing w:after="0" w:line="240" w:lineRule="auto"/>
+              <w:jc w:val="center"/>
+            </w:pPr>
+            <w:r/>
+          </w:p>
+          <w:p>
+            <w:pPr>
+              <w:spacing w:after="0" w:line="240" w:lineRule="auto"/>
+              <w:jc w:val="center"/>
+            </w:pPr>
+            <w:r/>
+          </w:p>
+          <w:p>
+            <w:pPr>
+              <w:spacing w:after="0" w:line="240" w:lineRule="auto"/>
+              <w:jc w:val="center"/>
+            </w:pPr>
+            <w:r/>
+          </w:p>
+          <w:p>
+            <w:pPr>
+              <w:spacing w:after="0" w:line="240" w:lineRule="auto"/>
+              <w:jc w:val="center"/>
+            </w:pPr>
+            <w:r/>
+          </w:p>
+          <w:p>
+            <w:pPr>
+              <w:spacing w:after="0" w:line="240" w:lineRule="auto"/>
+              <w:jc w:val="center"/>
+            </w:pPr>
+            <w:r/>
+          </w:p>
+          <w:p>
+            <w:pPr>
+              <w:spacing w:after="0" w:line="240" w:lineRule="auto"/>
+              <w:jc w:val="center"/>
+            </w:pPr>
+            <w:r/>
+          </w:p>
+          <w:p>
+            <w:pPr>
+              <w:spacing w:after="0" w:line="240" w:lineRule="auto"/>
+              <w:jc w:val="center"/>
+            </w:pPr>
+            <w:r/>
+          </w:p>
+          <w:p>
+            <w:pPr>
+              <w:spacing w:after="0" w:line="240" w:lineRule="auto"/>
+            </w:pPr>
+            <w:r/>
           </w:p>
         </w:tc>
         <w:tc>
@@ -603,46 +576,58 @@
               <w:spacing w:after="0" w:line="240" w:lineRule="auto"/>
               <w:jc w:val="center"/>
             </w:pPr>
+            <w:r>
+              <w:t>{{ item.qty }}</w:t>
+              <w:br/>
+              <w:t>{% endfor %}</w:t>
+            </w:r>
           </w:p>
           <w:p>
             <w:pPr>
               <w:spacing w:after="0"/>
             </w:pPr>
+            <w:r/>
           </w:p>
           <w:p>
             <w:pPr>
               <w:spacing w:after="0"/>
               <w:jc w:val="center"/>
             </w:pPr>
+            <w:r/>
           </w:p>
           <w:p>
             <w:pPr>
               <w:spacing w:after="0"/>
               <w:jc w:val="center"/>
             </w:pPr>
+            <w:r/>
           </w:p>
           <w:p>
             <w:pPr>
               <w:spacing w:after="0"/>
               <w:jc w:val="center"/>
             </w:pPr>
+            <w:r/>
           </w:p>
           <w:p>
             <w:pPr>
               <w:spacing w:after="0"/>
               <w:jc w:val="center"/>
             </w:pPr>
+            <w:r/>
           </w:p>
           <w:p>
             <w:pPr>
               <w:spacing w:after="0"/>
               <w:jc w:val="center"/>
             </w:pPr>
-          </w:p>
-          <w:p>
-            <w:pPr>
-              <w:jc w:val="center"/>
-            </w:pPr>
+            <w:r/>
+          </w:p>
+          <w:p>
+            <w:pPr>
+              <w:jc w:val="center"/>
+            </w:pPr>
+            <w:r/>
           </w:p>
         </w:tc>
       </w:tr>

</xml_diff>